<commit_message>
upgrade backlog and set sprint 1
</commit_message>
<xml_diff>
--- a/Reqs/AssetForge_vision_01.docx
+++ b/Reqs/AssetForge_vision_01.docx
@@ -2957,6 +2957,510 @@
     <w:p>
       <w:r>
         <w:t>That avoids rebuilding the conceptual identity later.</w:t>
+      </w:r>
+    </w:p>
+    <w:p/>
+    <w:p>
+      <w:pPr>
+        <w:rPr>
+          <w:rFonts w:ascii="Segoe UI" w:eastAsia="Times New Roman" w:hAnsi="Segoe UI" w:cs="Segoe UI"/>
+          <w:b/>
+          <w:bCs/>
+          <w:color w:val="1F2328"/>
+          <w:kern w:val="0"/>
+          <w:sz w:val="21"/>
+          <w:szCs w:val="21"/>
+          <w14:ligatures w14:val="none"/>
+        </w:rPr>
+      </w:pPr>
+    </w:p>
+    <w:p>
+      <w:r>
+        <w:t>**</w:t>
+      </w:r>
+      <w:proofErr w:type="spellStart"/>
+      <w:r>
+        <w:t>AssetForge</w:t>
+      </w:r>
+      <w:proofErr w:type="spellEnd"/>
+      <w:r>
+        <w:t xml:space="preserve"> is a better umbrella </w:t>
+      </w:r>
+      <w:proofErr w:type="gramStart"/>
+      <w:r>
+        <w:t>name.*</w:t>
+      </w:r>
+      <w:proofErr w:type="gramEnd"/>
+      <w:r>
+        <w:t>* We’ll use:</w:t>
+      </w:r>
+    </w:p>
+    <w:p/>
+    <w:p>
+      <w:r>
+        <w:t>- **Product/</w:t>
+      </w:r>
+      <w:proofErr w:type="gramStart"/>
+      <w:r>
+        <w:t>platform:*</w:t>
+      </w:r>
+      <w:proofErr w:type="gramEnd"/>
+      <w:r>
+        <w:t xml:space="preserve">* </w:t>
+      </w:r>
+      <w:proofErr w:type="spellStart"/>
+      <w:r>
+        <w:t>AssetForge</w:t>
+      </w:r>
+      <w:proofErr w:type="spellEnd"/>
+    </w:p>
+    <w:p>
+      <w:r>
+        <w:t xml:space="preserve">- **Initial domain </w:t>
+      </w:r>
+      <w:proofErr w:type="gramStart"/>
+      <w:r>
+        <w:t>module:*</w:t>
+      </w:r>
+      <w:proofErr w:type="gramEnd"/>
+      <w:r>
+        <w:t xml:space="preserve">* </w:t>
+      </w:r>
+      <w:proofErr w:type="spellStart"/>
+      <w:r>
+        <w:t>StockForge</w:t>
+      </w:r>
+      <w:proofErr w:type="spellEnd"/>
+    </w:p>
+    <w:p>
+      <w:r>
+        <w:t xml:space="preserve">- **Repository </w:t>
+      </w:r>
+      <w:proofErr w:type="gramStart"/>
+      <w:r>
+        <w:t>name:*</w:t>
+      </w:r>
+      <w:proofErr w:type="gramEnd"/>
+      <w:r>
+        <w:t>* `</w:t>
+      </w:r>
+      <w:proofErr w:type="spellStart"/>
+      <w:r>
+        <w:t>AssetForge</w:t>
+      </w:r>
+      <w:proofErr w:type="spellEnd"/>
+      <w:r>
+        <w:t>`</w:t>
+      </w:r>
+    </w:p>
+    <w:p>
+      <w:r>
+        <w:t xml:space="preserve">- **Initial </w:t>
+      </w:r>
+      <w:proofErr w:type="gramStart"/>
+      <w:r>
+        <w:t>focus:*</w:t>
+      </w:r>
+      <w:proofErr w:type="gramEnd"/>
+      <w:r>
+        <w:t>* stock-marketplace metadata, designed for future portfolio, social, DAM, SEO, accessibility, and e-commerce profiles</w:t>
+      </w:r>
+    </w:p>
+    <w:p/>
+    <w:p>
+      <w:r>
+        <w:t>On the GitHub “Create a new repository” page, choose:</w:t>
+      </w:r>
+    </w:p>
+    <w:p/>
+    <w:p>
+      <w:r>
+        <w:t xml:space="preserve">- **Repository </w:t>
+      </w:r>
+      <w:proofErr w:type="gramStart"/>
+      <w:r>
+        <w:t>name:*</w:t>
+      </w:r>
+      <w:proofErr w:type="gramEnd"/>
+      <w:r>
+        <w:t>* `</w:t>
+      </w:r>
+      <w:proofErr w:type="spellStart"/>
+      <w:r>
+        <w:t>AssetForge</w:t>
+      </w:r>
+      <w:proofErr w:type="spellEnd"/>
+      <w:r>
+        <w:t>`</w:t>
+      </w:r>
+    </w:p>
+    <w:p>
+      <w:r>
+        <w:t>- **</w:t>
+      </w:r>
+      <w:proofErr w:type="gramStart"/>
+      <w:r>
+        <w:t>Visibility:*</w:t>
+      </w:r>
+      <w:proofErr w:type="gramEnd"/>
+      <w:r>
+        <w:t>* Private</w:t>
+      </w:r>
+    </w:p>
+    <w:p>
+      <w:r>
+        <w:t xml:space="preserve">- **Add </w:t>
+      </w:r>
+      <w:proofErr w:type="gramStart"/>
+      <w:r>
+        <w:t>README:*</w:t>
+      </w:r>
+      <w:proofErr w:type="gramEnd"/>
+      <w:r>
+        <w:t>* On</w:t>
+      </w:r>
+    </w:p>
+    <w:p>
+      <w:r>
+        <w:t>- **</w:t>
+      </w:r>
+      <w:proofErr w:type="gramStart"/>
+      <w:r>
+        <w:t>`.</w:t>
+      </w:r>
+      <w:proofErr w:type="spellStart"/>
+      <w:r>
+        <w:t>gitignore</w:t>
+      </w:r>
+      <w:proofErr w:type="spellEnd"/>
+      <w:r>
+        <w:t>`:*</w:t>
+      </w:r>
+      <w:proofErr w:type="gramEnd"/>
+      <w:r>
+        <w:t>* Python</w:t>
+      </w:r>
+    </w:p>
+    <w:p>
+      <w:r>
+        <w:t>- **</w:t>
+      </w:r>
+      <w:proofErr w:type="gramStart"/>
+      <w:r>
+        <w:t>License:*</w:t>
+      </w:r>
+      <w:proofErr w:type="gramEnd"/>
+      <w:r>
+        <w:t>* MIT</w:t>
+      </w:r>
+    </w:p>
+    <w:p/>
+    <w:p>
+      <w:r>
+        <w:t>The repository description can be:</w:t>
+      </w:r>
+    </w:p>
+    <w:p/>
+    <w:p>
+      <w:r>
+        <w:t>```text</w:t>
+      </w:r>
+    </w:p>
+    <w:p>
+      <w:r>
+        <w:t>Specification-driven multi-agent platform for generating, validating, reviewing, and exporting metadata for visual assets across multiple channels.</w:t>
+      </w:r>
+    </w:p>
+    <w:p>
+      <w:r>
+        <w:t>```</w:t>
+      </w:r>
+    </w:p>
+    <w:p/>
+    <w:p>
+      <w:r>
+        <w:t>If your personal account allows repository creation, click **Create repository**. Then send me the resulting repository URL.</w:t>
+      </w:r>
+    </w:p>
+    <w:p/>
+    <w:p>
+      <w:r>
+        <w:t>Our first repository content will be **specifications only**—no application code:</w:t>
+      </w:r>
+    </w:p>
+    <w:p/>
+    <w:p>
+      <w:r>
+        <w:t>```text</w:t>
+      </w:r>
+    </w:p>
+    <w:p>
+      <w:proofErr w:type="spellStart"/>
+      <w:r>
+        <w:t>AssetForge</w:t>
+      </w:r>
+      <w:proofErr w:type="spellEnd"/>
+      <w:r>
+        <w:t>/</w:t>
+      </w:r>
+    </w:p>
+    <w:p>
+      <w:r>
+        <w:rPr>
+          <w:rFonts w:ascii="MS Gothic" w:eastAsia="MS Gothic" w:hAnsi="MS Gothic" w:cs="MS Gothic" w:hint="eastAsia"/>
+        </w:rPr>
+        <w:t>├</w:t>
+      </w:r>
+      <w:r>
+        <w:t>── README.md</w:t>
+      </w:r>
+    </w:p>
+    <w:p>
+      <w:r>
+        <w:rPr>
+          <w:rFonts w:ascii="MS Gothic" w:eastAsia="MS Gothic" w:hAnsi="MS Gothic" w:cs="MS Gothic" w:hint="eastAsia"/>
+        </w:rPr>
+        <w:t>├</w:t>
+      </w:r>
+      <w:r>
+        <w:t>── docs/</w:t>
+      </w:r>
+    </w:p>
+    <w:p>
+      <w:r>
+        <w:t xml:space="preserve">│   </w:t>
+      </w:r>
+      <w:r>
+        <w:rPr>
+          <w:rFonts w:ascii="MS Gothic" w:eastAsia="MS Gothic" w:hAnsi="MS Gothic" w:cs="MS Gothic" w:hint="eastAsia"/>
+        </w:rPr>
+        <w:t>├</w:t>
+      </w:r>
+      <w:r>
+        <w:t>── product-vision.md</w:t>
+      </w:r>
+    </w:p>
+    <w:p>
+      <w:r>
+        <w:t xml:space="preserve">│   </w:t>
+      </w:r>
+      <w:r>
+        <w:rPr>
+          <w:rFonts w:ascii="MS Gothic" w:eastAsia="MS Gothic" w:hAnsi="MS Gothic" w:cs="MS Gothic" w:hint="eastAsia"/>
+        </w:rPr>
+        <w:t>├</w:t>
+      </w:r>
+      <w:r>
+        <w:t>── domain-model.md</w:t>
+      </w:r>
+    </w:p>
+    <w:p>
+      <w:r>
+        <w:t xml:space="preserve">│   </w:t>
+      </w:r>
+      <w:r>
+        <w:rPr>
+          <w:rFonts w:ascii="MS Gothic" w:eastAsia="MS Gothic" w:hAnsi="MS Gothic" w:cs="MS Gothic" w:hint="eastAsia"/>
+        </w:rPr>
+        <w:t>├</w:t>
+      </w:r>
+      <w:r>
+        <w:t>── requirements.md</w:t>
+      </w:r>
+    </w:p>
+    <w:p>
+      <w:r>
+        <w:lastRenderedPageBreak/>
+        <w:t xml:space="preserve">│   </w:t>
+      </w:r>
+      <w:r>
+        <w:rPr>
+          <w:rFonts w:ascii="MS Gothic" w:eastAsia="MS Gothic" w:hAnsi="MS Gothic" w:cs="MS Gothic" w:hint="eastAsia"/>
+        </w:rPr>
+        <w:t>├</w:t>
+      </w:r>
+      <w:r>
+        <w:t>── architecture.md</w:t>
+      </w:r>
+    </w:p>
+    <w:p>
+      <w:r>
+        <w:t xml:space="preserve">│   </w:t>
+      </w:r>
+      <w:r>
+        <w:rPr>
+          <w:rFonts w:ascii="MS Gothic" w:eastAsia="MS Gothic" w:hAnsi="MS Gothic" w:cs="MS Gothic" w:hint="eastAsia"/>
+        </w:rPr>
+        <w:t>├</w:t>
+      </w:r>
+      <w:r>
+        <w:t>── agent-specifications/</w:t>
+      </w:r>
+    </w:p>
+    <w:p>
+      <w:r>
+        <w:t xml:space="preserve">│   </w:t>
+      </w:r>
+      <w:r>
+        <w:rPr>
+          <w:rFonts w:ascii="MS Gothic" w:eastAsia="MS Gothic" w:hAnsi="MS Gothic" w:cs="MS Gothic" w:hint="eastAsia"/>
+        </w:rPr>
+        <w:t>├</w:t>
+      </w:r>
+      <w:r>
+        <w:t>── content-profiles/</w:t>
+      </w:r>
+    </w:p>
+    <w:p>
+      <w:r>
+        <w:t xml:space="preserve">│   </w:t>
+      </w:r>
+      <w:r>
+        <w:rPr>
+          <w:rFonts w:ascii="MS Gothic" w:eastAsia="MS Gothic" w:hAnsi="MS Gothic" w:cs="MS Gothic" w:hint="eastAsia"/>
+        </w:rPr>
+        <w:t>├</w:t>
+      </w:r>
+      <w:r>
+        <w:t>── platform-requirements/</w:t>
+      </w:r>
+    </w:p>
+    <w:p>
+      <w:r>
+        <w:t xml:space="preserve">│   </w:t>
+      </w:r>
+      <w:r>
+        <w:rPr>
+          <w:rFonts w:ascii="MS Gothic" w:eastAsia="MS Gothic" w:hAnsi="MS Gothic" w:cs="MS Gothic" w:hint="eastAsia"/>
+        </w:rPr>
+        <w:t>├</w:t>
+      </w:r>
+      <w:r>
+        <w:t>── evaluation-strategy.md</w:t>
+      </w:r>
+    </w:p>
+    <w:p>
+      <w:r>
+        <w:t xml:space="preserve">│   └── </w:t>
+      </w:r>
+      <w:proofErr w:type="spellStart"/>
+      <w:r>
+        <w:t>adr</w:t>
+      </w:r>
+      <w:proofErr w:type="spellEnd"/>
+      <w:r>
+        <w:t>/</w:t>
+      </w:r>
+    </w:p>
+    <w:p>
+      <w:r>
+        <w:rPr>
+          <w:rFonts w:ascii="MS Gothic" w:eastAsia="MS Gothic" w:hAnsi="MS Gothic" w:cs="MS Gothic" w:hint="eastAsia"/>
+        </w:rPr>
+        <w:t>├</w:t>
+      </w:r>
+      <w:r>
+        <w:t>── schemas/</w:t>
+      </w:r>
+    </w:p>
+    <w:p>
+      <w:r>
+        <w:t>└── backlog/</w:t>
+      </w:r>
+    </w:p>
+    <w:p>
+      <w:r>
+        <w:t>```</w:t>
+      </w:r>
+    </w:p>
+    <w:p/>
+    <w:p>
+      <w:r>
+        <w:t>The first backlog structure will cover:</w:t>
+      </w:r>
+    </w:p>
+    <w:p/>
+    <w:p>
+      <w:r>
+        <w:t>1. **MVP0 — Product vision and domain model**</w:t>
+      </w:r>
+    </w:p>
+    <w:p>
+      <w:r>
+        <w:t>2. **MVP1 — Universal asset intelligence specification**</w:t>
+      </w:r>
+    </w:p>
+    <w:p>
+      <w:r>
+        <w:t xml:space="preserve">3. **MVP2 — </w:t>
+      </w:r>
+      <w:proofErr w:type="spellStart"/>
+      <w:r>
+        <w:t>StockForge</w:t>
+      </w:r>
+      <w:proofErr w:type="spellEnd"/>
+      <w:r>
+        <w:t>/iStock profile**</w:t>
+      </w:r>
+    </w:p>
+    <w:p>
+      <w:r>
+        <w:t>4. **MVP3 — Generic descriptions and keywords**</w:t>
+      </w:r>
+    </w:p>
+    <w:p>
+      <w:r>
+        <w:t>5. **MVP4 — Human review and content packages**</w:t>
+      </w:r>
+    </w:p>
+    <w:p>
+      <w:r>
+        <w:t>6. **MVP5 — Local folders and batch processing**</w:t>
+      </w:r>
+    </w:p>
+    <w:p>
+      <w:r>
+        <w:t>7. **MVP6 — Additional stock profiles**</w:t>
+      </w:r>
+    </w:p>
+    <w:p>
+      <w:r>
+        <w:t>8. **MVP7 — Portfolio and social profiles**</w:t>
+      </w:r>
+    </w:p>
+    <w:p>
+      <w:r>
+        <w:t>9. **MVP8 — DAM and archive profiles**</w:t>
+      </w:r>
+    </w:p>
+    <w:p>
+      <w:r>
+        <w:t>10. **MVP9 — Video and vector workflows**</w:t>
+      </w:r>
+    </w:p>
+    <w:p>
+      <w:r>
+        <w:t>11. **MVP10 — Agile development agent team**</w:t>
+      </w:r>
+    </w:p>
+    <w:p>
+      <w:r>
+        <w:t>12. **MVP11 — Enterprise deployment**</w:t>
+      </w:r>
+    </w:p>
+    <w:p/>
+    <w:p>
+      <w:r>
+        <w:lastRenderedPageBreak/>
+        <w:t>After you create `</w:t>
+      </w:r>
+      <w:proofErr w:type="spellStart"/>
+      <w:r>
+        <w:t>AssetForge</w:t>
+      </w:r>
+      <w:proofErr w:type="spellEnd"/>
+      <w:r>
+        <w:t>`, send the repository URL and I’ll prepare the specification-first backlog.</w:t>
       </w:r>
     </w:p>
     <w:sectPr>
@@ -2967,6 +3471,315 @@
     </w:sectPr>
   </w:body>
 </w:document>
+</file>
+
+<file path=word/numbering.xml><?xml version="1.0" encoding="utf-8"?>
+<w:numbering xmlns:wpc="http://schemas.microsoft.com/office/word/2010/wordprocessingCanvas" xmlns:cx="http://schemas.microsoft.com/office/drawing/2014/chartex" xmlns:cx1="http://schemas.microsoft.com/office/drawing/2015/9/8/chartex" xmlns:cx2="http://schemas.microsoft.com/office/drawing/2015/10/21/chartex" xmlns:cx3="http://schemas.microsoft.com/office/drawing/2016/5/9/chartex" xmlns:cx4="http://schemas.microsoft.com/office/drawing/2016/5/10/chartex" xmlns:cx5="http://schemas.microsoft.com/office/drawing/2016/5/11/chartex" xmlns:cx6="http://schemas.microsoft.com/office/drawing/2016/5/12/chartex" xmlns:cx7="http://schemas.microsoft.com/office/drawing/2016/5/13/chartex" xmlns:cx8="http://schemas.microsoft.com/office/drawing/2016/5/14/chartex" xmlns:mc="http://schemas.openxmlformats.org/markup-compatibility/2006" xmlns:aink="http://schemas.microsoft.com/office/drawing/2016/ink" xmlns:am3d="http://schemas.microsoft.com/office/drawing/2017/model3d" xmlns:o="urn:schemas-microsoft-com:office:office" xmlns:oel="http://schemas.microsoft.com/office/2019/extlst" xmlns:r="http://schemas.openxmlformats.org/officeDocument/2006/relationships" xmlns:m="http://schemas.openxmlformats.org/officeDocument/2006/math" xmlns:v="urn:schemas-microsoft-com:vml" xmlns:wp14="http://schemas.microsoft.com/office/word/2010/wordprocessingDrawing" xmlns:wp="http://schemas.openxmlformats.org/drawingml/2006/wordprocessingDrawing" xmlns:w10="urn:schemas-microsoft-com:office:word" xmlns:w="http://schemas.openxmlformats.org/wordprocessingml/2006/main" xmlns:w14="http://schemas.microsoft.com/office/word/2010/wordml" xmlns:w15="http://schemas.microsoft.com/office/word/2012/wordml" xmlns:w16cex="http://schemas.microsoft.com/office/word/2018/wordml/cex" xmlns:w16cid="http://schemas.microsoft.com/office/word/2016/wordml/cid" xmlns:w16="http://schemas.microsoft.com/office/word/2018/wordml" xmlns:w16du="http://schemas.microsoft.com/office/word/2023/wordml/word16du" xmlns:w16sdtdh="http://schemas.microsoft.com/office/word/2020/wordml/sdtdatahash" xmlns:w16sdtfl="http://schemas.microsoft.com/office/word/2024/wordml/sdtformatlock" xmlns:w16se="http://schemas.microsoft.com/office/word/2015/wordml/symex" xmlns:wpg="http://schemas.microsoft.com/office/word/2010/wordprocessingGroup" xmlns:wpi="http://schemas.microsoft.com/office/word/2010/wordprocessingInk" xmlns:wne="http://schemas.microsoft.com/office/word/2006/wordml" xmlns:wps="http://schemas.microsoft.com/office/word/2010/wordprocessingShape" mc:Ignorable="w14 w15 w16se w16cid w16 w16cex w16sdtdh w16sdtfl w16du wp14">
+  <w:abstractNum w:abstractNumId="0" w15:restartNumberingAfterBreak="0">
+    <w:nsid w:val="1AB71324"/>
+    <w:multiLevelType w:val="multilevel"/>
+    <w:tmpl w:val="003C7FB6"/>
+    <w:lvl w:ilvl="0">
+      <w:start w:val="1"/>
+      <w:numFmt w:val="bullet"/>
+      <w:lvlText w:val=""/>
+      <w:lvlJc w:val="left"/>
+      <w:pPr>
+        <w:tabs>
+          <w:tab w:val="num" w:pos="720"/>
+        </w:tabs>
+        <w:ind w:left="720" w:hanging="360"/>
+      </w:pPr>
+      <w:rPr>
+        <w:rFonts w:ascii="Symbol" w:hAnsi="Symbol" w:hint="default"/>
+        <w:sz w:val="20"/>
+      </w:rPr>
+    </w:lvl>
+    <w:lvl w:ilvl="1" w:tentative="1">
+      <w:start w:val="1"/>
+      <w:numFmt w:val="bullet"/>
+      <w:lvlText w:val="o"/>
+      <w:lvlJc w:val="left"/>
+      <w:pPr>
+        <w:tabs>
+          <w:tab w:val="num" w:pos="1440"/>
+        </w:tabs>
+        <w:ind w:left="1440" w:hanging="360"/>
+      </w:pPr>
+      <w:rPr>
+        <w:rFonts w:ascii="Courier New" w:hAnsi="Courier New" w:hint="default"/>
+        <w:sz w:val="20"/>
+      </w:rPr>
+    </w:lvl>
+    <w:lvl w:ilvl="2" w:tentative="1">
+      <w:start w:val="1"/>
+      <w:numFmt w:val="bullet"/>
+      <w:lvlText w:val=""/>
+      <w:lvlJc w:val="left"/>
+      <w:pPr>
+        <w:tabs>
+          <w:tab w:val="num" w:pos="2160"/>
+        </w:tabs>
+        <w:ind w:left="2160" w:hanging="360"/>
+      </w:pPr>
+      <w:rPr>
+        <w:rFonts w:ascii="Wingdings" w:hAnsi="Wingdings" w:hint="default"/>
+        <w:sz w:val="20"/>
+      </w:rPr>
+    </w:lvl>
+    <w:lvl w:ilvl="3" w:tentative="1">
+      <w:start w:val="1"/>
+      <w:numFmt w:val="bullet"/>
+      <w:lvlText w:val=""/>
+      <w:lvlJc w:val="left"/>
+      <w:pPr>
+        <w:tabs>
+          <w:tab w:val="num" w:pos="2880"/>
+        </w:tabs>
+        <w:ind w:left="2880" w:hanging="360"/>
+      </w:pPr>
+      <w:rPr>
+        <w:rFonts w:ascii="Wingdings" w:hAnsi="Wingdings" w:hint="default"/>
+        <w:sz w:val="20"/>
+      </w:rPr>
+    </w:lvl>
+    <w:lvl w:ilvl="4" w:tentative="1">
+      <w:start w:val="1"/>
+      <w:numFmt w:val="bullet"/>
+      <w:lvlText w:val=""/>
+      <w:lvlJc w:val="left"/>
+      <w:pPr>
+        <w:tabs>
+          <w:tab w:val="num" w:pos="3600"/>
+        </w:tabs>
+        <w:ind w:left="3600" w:hanging="360"/>
+      </w:pPr>
+      <w:rPr>
+        <w:rFonts w:ascii="Wingdings" w:hAnsi="Wingdings" w:hint="default"/>
+        <w:sz w:val="20"/>
+      </w:rPr>
+    </w:lvl>
+    <w:lvl w:ilvl="5" w:tentative="1">
+      <w:start w:val="1"/>
+      <w:numFmt w:val="bullet"/>
+      <w:lvlText w:val=""/>
+      <w:lvlJc w:val="left"/>
+      <w:pPr>
+        <w:tabs>
+          <w:tab w:val="num" w:pos="4320"/>
+        </w:tabs>
+        <w:ind w:left="4320" w:hanging="360"/>
+      </w:pPr>
+      <w:rPr>
+        <w:rFonts w:ascii="Wingdings" w:hAnsi="Wingdings" w:hint="default"/>
+        <w:sz w:val="20"/>
+      </w:rPr>
+    </w:lvl>
+    <w:lvl w:ilvl="6" w:tentative="1">
+      <w:start w:val="1"/>
+      <w:numFmt w:val="bullet"/>
+      <w:lvlText w:val=""/>
+      <w:lvlJc w:val="left"/>
+      <w:pPr>
+        <w:tabs>
+          <w:tab w:val="num" w:pos="5040"/>
+        </w:tabs>
+        <w:ind w:left="5040" w:hanging="360"/>
+      </w:pPr>
+      <w:rPr>
+        <w:rFonts w:ascii="Wingdings" w:hAnsi="Wingdings" w:hint="default"/>
+        <w:sz w:val="20"/>
+      </w:rPr>
+    </w:lvl>
+    <w:lvl w:ilvl="7" w:tentative="1">
+      <w:start w:val="1"/>
+      <w:numFmt w:val="bullet"/>
+      <w:lvlText w:val=""/>
+      <w:lvlJc w:val="left"/>
+      <w:pPr>
+        <w:tabs>
+          <w:tab w:val="num" w:pos="5760"/>
+        </w:tabs>
+        <w:ind w:left="5760" w:hanging="360"/>
+      </w:pPr>
+      <w:rPr>
+        <w:rFonts w:ascii="Wingdings" w:hAnsi="Wingdings" w:hint="default"/>
+        <w:sz w:val="20"/>
+      </w:rPr>
+    </w:lvl>
+    <w:lvl w:ilvl="8" w:tentative="1">
+      <w:start w:val="1"/>
+      <w:numFmt w:val="bullet"/>
+      <w:lvlText w:val=""/>
+      <w:lvlJc w:val="left"/>
+      <w:pPr>
+        <w:tabs>
+          <w:tab w:val="num" w:pos="6480"/>
+        </w:tabs>
+        <w:ind w:left="6480" w:hanging="360"/>
+      </w:pPr>
+      <w:rPr>
+        <w:rFonts w:ascii="Wingdings" w:hAnsi="Wingdings" w:hint="default"/>
+        <w:sz w:val="20"/>
+      </w:rPr>
+    </w:lvl>
+  </w:abstractNum>
+  <w:abstractNum w:abstractNumId="1" w15:restartNumberingAfterBreak="0">
+    <w:nsid w:val="338952D8"/>
+    <w:multiLevelType w:val="multilevel"/>
+    <w:tmpl w:val="01382470"/>
+    <w:lvl w:ilvl="0">
+      <w:start w:val="1"/>
+      <w:numFmt w:val="bullet"/>
+      <w:lvlText w:val=""/>
+      <w:lvlJc w:val="left"/>
+      <w:pPr>
+        <w:tabs>
+          <w:tab w:val="num" w:pos="720"/>
+        </w:tabs>
+        <w:ind w:left="720" w:hanging="360"/>
+      </w:pPr>
+      <w:rPr>
+        <w:rFonts w:ascii="Symbol" w:hAnsi="Symbol" w:hint="default"/>
+        <w:sz w:val="20"/>
+      </w:rPr>
+    </w:lvl>
+    <w:lvl w:ilvl="1" w:tentative="1">
+      <w:start w:val="1"/>
+      <w:numFmt w:val="bullet"/>
+      <w:lvlText w:val="o"/>
+      <w:lvlJc w:val="left"/>
+      <w:pPr>
+        <w:tabs>
+          <w:tab w:val="num" w:pos="1440"/>
+        </w:tabs>
+        <w:ind w:left="1440" w:hanging="360"/>
+      </w:pPr>
+      <w:rPr>
+        <w:rFonts w:ascii="Courier New" w:hAnsi="Courier New" w:hint="default"/>
+        <w:sz w:val="20"/>
+      </w:rPr>
+    </w:lvl>
+    <w:lvl w:ilvl="2" w:tentative="1">
+      <w:start w:val="1"/>
+      <w:numFmt w:val="bullet"/>
+      <w:lvlText w:val=""/>
+      <w:lvlJc w:val="left"/>
+      <w:pPr>
+        <w:tabs>
+          <w:tab w:val="num" w:pos="2160"/>
+        </w:tabs>
+        <w:ind w:left="2160" w:hanging="360"/>
+      </w:pPr>
+      <w:rPr>
+        <w:rFonts w:ascii="Wingdings" w:hAnsi="Wingdings" w:hint="default"/>
+        <w:sz w:val="20"/>
+      </w:rPr>
+    </w:lvl>
+    <w:lvl w:ilvl="3" w:tentative="1">
+      <w:start w:val="1"/>
+      <w:numFmt w:val="bullet"/>
+      <w:lvlText w:val=""/>
+      <w:lvlJc w:val="left"/>
+      <w:pPr>
+        <w:tabs>
+          <w:tab w:val="num" w:pos="2880"/>
+        </w:tabs>
+        <w:ind w:left="2880" w:hanging="360"/>
+      </w:pPr>
+      <w:rPr>
+        <w:rFonts w:ascii="Wingdings" w:hAnsi="Wingdings" w:hint="default"/>
+        <w:sz w:val="20"/>
+      </w:rPr>
+    </w:lvl>
+    <w:lvl w:ilvl="4" w:tentative="1">
+      <w:start w:val="1"/>
+      <w:numFmt w:val="bullet"/>
+      <w:lvlText w:val=""/>
+      <w:lvlJc w:val="left"/>
+      <w:pPr>
+        <w:tabs>
+          <w:tab w:val="num" w:pos="3600"/>
+        </w:tabs>
+        <w:ind w:left="3600" w:hanging="360"/>
+      </w:pPr>
+      <w:rPr>
+        <w:rFonts w:ascii="Wingdings" w:hAnsi="Wingdings" w:hint="default"/>
+        <w:sz w:val="20"/>
+      </w:rPr>
+    </w:lvl>
+    <w:lvl w:ilvl="5" w:tentative="1">
+      <w:start w:val="1"/>
+      <w:numFmt w:val="bullet"/>
+      <w:lvlText w:val=""/>
+      <w:lvlJc w:val="left"/>
+      <w:pPr>
+        <w:tabs>
+          <w:tab w:val="num" w:pos="4320"/>
+        </w:tabs>
+        <w:ind w:left="4320" w:hanging="360"/>
+      </w:pPr>
+      <w:rPr>
+        <w:rFonts w:ascii="Wingdings" w:hAnsi="Wingdings" w:hint="default"/>
+        <w:sz w:val="20"/>
+      </w:rPr>
+    </w:lvl>
+    <w:lvl w:ilvl="6" w:tentative="1">
+      <w:start w:val="1"/>
+      <w:numFmt w:val="bullet"/>
+      <w:lvlText w:val=""/>
+      <w:lvlJc w:val="left"/>
+      <w:pPr>
+        <w:tabs>
+          <w:tab w:val="num" w:pos="5040"/>
+        </w:tabs>
+        <w:ind w:left="5040" w:hanging="360"/>
+      </w:pPr>
+      <w:rPr>
+        <w:rFonts w:ascii="Wingdings" w:hAnsi="Wingdings" w:hint="default"/>
+        <w:sz w:val="20"/>
+      </w:rPr>
+    </w:lvl>
+    <w:lvl w:ilvl="7" w:tentative="1">
+      <w:start w:val="1"/>
+      <w:numFmt w:val="bullet"/>
+      <w:lvlText w:val=""/>
+      <w:lvlJc w:val="left"/>
+      <w:pPr>
+        <w:tabs>
+          <w:tab w:val="num" w:pos="5760"/>
+        </w:tabs>
+        <w:ind w:left="5760" w:hanging="360"/>
+      </w:pPr>
+      <w:rPr>
+        <w:rFonts w:ascii="Wingdings" w:hAnsi="Wingdings" w:hint="default"/>
+        <w:sz w:val="20"/>
+      </w:rPr>
+    </w:lvl>
+    <w:lvl w:ilvl="8" w:tentative="1">
+      <w:start w:val="1"/>
+      <w:numFmt w:val="bullet"/>
+      <w:lvlText w:val=""/>
+      <w:lvlJc w:val="left"/>
+      <w:pPr>
+        <w:tabs>
+          <w:tab w:val="num" w:pos="6480"/>
+        </w:tabs>
+        <w:ind w:left="6480" w:hanging="360"/>
+      </w:pPr>
+      <w:rPr>
+        <w:rFonts w:ascii="Wingdings" w:hAnsi="Wingdings" w:hint="default"/>
+        <w:sz w:val="20"/>
+      </w:rPr>
+    </w:lvl>
+  </w:abstractNum>
+  <w:num w:numId="1" w16cid:durableId="1956792716">
+    <w:abstractNumId w:val="0"/>
+  </w:num>
+  <w:num w:numId="2" w16cid:durableId="807550901">
+    <w:abstractNumId w:val="1"/>
+  </w:num>
+</w:numbering>
 </file>
 
 <file path=word/styles.xml><?xml version="1.0" encoding="utf-8"?>
@@ -3886,6 +4699,46 @@
       <w:spacing w:val="5"/>
     </w:rPr>
   </w:style>
+  <w:style w:type="paragraph" w:styleId="NormalWeb">
+    <w:name w:val="Normal (Web)"/>
+    <w:basedOn w:val="Normal"/>
+    <w:uiPriority w:val="99"/>
+    <w:semiHidden/>
+    <w:unhideWhenUsed/>
+    <w:rsid w:val="004D1A68"/>
+    <w:pPr>
+      <w:spacing w:before="100" w:beforeAutospacing="1" w:after="100" w:afterAutospacing="1" w:line="240" w:lineRule="auto"/>
+    </w:pPr>
+    <w:rPr>
+      <w:rFonts w:ascii="Times New Roman" w:eastAsia="Times New Roman" w:hAnsi="Times New Roman" w:cs="Times New Roman"/>
+      <w:kern w:val="0"/>
+      <w14:ligatures w14:val="none"/>
+    </w:rPr>
+  </w:style>
+  <w:style w:type="character" w:styleId="Strong">
+    <w:name w:val="Strong"/>
+    <w:basedOn w:val="DefaultParagraphFont"/>
+    <w:uiPriority w:val="22"/>
+    <w:qFormat/>
+    <w:rsid w:val="004D1A68"/>
+    <w:rPr>
+      <w:b/>
+      <w:bCs/>
+    </w:rPr>
+  </w:style>
+  <w:style w:type="character" w:styleId="HTMLCode">
+    <w:name w:val="HTML Code"/>
+    <w:basedOn w:val="DefaultParagraphFont"/>
+    <w:uiPriority w:val="99"/>
+    <w:semiHidden/>
+    <w:unhideWhenUsed/>
+    <w:rsid w:val="004D1A68"/>
+    <w:rPr>
+      <w:rFonts w:ascii="Courier New" w:eastAsia="Times New Roman" w:hAnsi="Courier New" w:cs="Courier New"/>
+      <w:sz w:val="20"/>
+      <w:szCs w:val="20"/>
+    </w:rPr>
+  </w:style>
 </w:styles>
 </file>
 

</xml_diff>